<commit_message>
Added javascript for book interface
</commit_message>
<xml_diff>
--- a/Portfolio-Items/assets/projects/Book Interface Project Analysis_ Design.docx
+++ b/Portfolio-Items/assets/projects/Book Interface Project Analysis_ Design.docx
@@ -170,7 +170,9 @@
     </w:p>
     <w:p>
       <w:pPr>
-        <w:rPr/>
+        <w:rPr>
+          <w:rFonts w:ascii="Times New Roman" w:cs="Times New Roman" w:eastAsia="Times New Roman" w:hAnsi="Times New Roman"/>
+        </w:rPr>
       </w:pPr>
       <w:r>
         <w:rPr>
@@ -758,6 +760,7 @@
     <w:p>
       <w:pPr>
         <w:rPr>
+          <w:rFonts w:ascii="Times New Roman" w:cs="Times New Roman" w:eastAsia="Times New Roman" w:hAnsi="Times New Roman"/>
           <w:b w:val="1"/>
           <w:bCs w:val="1"/>
         </w:rPr>
@@ -905,7 +908,7 @@
           <w:szCs w:val="24"/>
           <w:rtl w:val="0"/>
         </w:rPr>
-        <w:t xml:space="preserve">The main elements of the interface will include three different search options: book title, author’s name, and a general subject of books. It is important to note that the user will not need to input information across all three fields. However, one of the fields must have a value in order for the interface to function. </w:t>
+        <w:t xml:space="preserve">The main elements of the interface will include three different search options: book title, author’s name, and a general subject of books. It is important to note that the user will not need to input information across all three fields. However, one of the fields must have a value in order for the interface to function. If the user decides to input information in more than one field, the system will generate an alert message, informing the user that they can’t input data in more than one field. </w:t>
       </w:r>
     </w:p>
     <w:p>
@@ -1086,7 +1089,7 @@
           <w:szCs w:val="24"/>
           <w:rtl w:val="0"/>
         </w:rPr>
-        <w:t xml:space="preserve">This formatting may vary based on the user’s input. If the user decides to search the interface with the author’s name, then the search results will list around 3 different books that the author had published. However, if the user opts to search through the general subject category then, the search results will display books based on the inputted category. Searching by the book title will return at least 3 books with the same title (if applicable), however, the books may not be written by the same author. </w:t>
+        <w:t xml:space="preserve">This formatting may vary based on the user’s input. The user will not have the option to populate data to all three text fields because the system will be designed to show an alert that the user must only enter one field.  If the user decides to search the interface with the author’s name, then the search results will list around 3 different books that the author had published. If the user inputs only the first or last name of an author, then the system will showcase books listed alphabetically. However, if the user opts to search through the general subject category then, the search results will display books based on the inputted category. Searching by the book title will return at least 3 books with the same title (if applicable), however, the books may not be written by the same author. </w:t>
         <w:br w:type="textWrapping"/>
         <w:br w:type="textWrapping"/>
         <w:t xml:space="preserve">Errors on the interface such as not inputting a value in any of the three columns or not receiving a value through the API calls will be noted in the interface as an error message. This allows users to understand why the interface ceases to function. </w:t>
@@ -1094,8 +1097,228 @@
         <w:br w:type="textWrapping"/>
         <w:t xml:space="preserve">This interface will not store data from past searches. It is also imperative to note that the interface will require a working internet connection to function, since the project will be developed through the Github environment. </w:t>
         <w:br w:type="textWrapping"/>
+      </w:r>
+    </w:p>
+    <w:p>
+      <w:pPr>
+        <w:pStyle w:val="Heading3"/>
+        <w:rPr>
+          <w:rFonts w:ascii="Times New Roman" w:cs="Times New Roman" w:eastAsia="Times New Roman" w:hAnsi="Times New Roman"/>
+          <w:b w:val="1"/>
+          <w:bCs w:val="1"/>
+          <w:color w:val="000000"/>
+          <w:sz w:val="24"/>
+          <w:szCs w:val="24"/>
+        </w:rPr>
+      </w:pPr>
+      <w:bookmarkStart w:colFirst="0" w:colLast="0" w:name="_ldvb9dqhv1rz" w:id="3"/>
+      <w:bookmarkEnd w:id="3"/>
+      <w:r>
+        <w:rPr>
+          <w:rFonts w:ascii="Times New Roman" w:cs="Times New Roman" w:eastAsia="Times New Roman" w:hAnsi="Times New Roman"/>
+          <w:b w:val="1"/>
+          <w:bCs w:val="1"/>
+          <w:color w:val="000000"/>
+          <w:sz w:val="24"/>
+          <w:szCs w:val="24"/>
+          <w:rtl w:val="0"/>
+        </w:rPr>
+        <w:t xml:space="preserve">Expected Output: </w:t>
+      </w:r>
+    </w:p>
+    <w:p>
+      <w:pPr>
+        <w:rPr>
+          <w:rFonts w:ascii="Times New Roman" w:cs="Times New Roman" w:eastAsia="Times New Roman" w:hAnsi="Times New Roman"/>
+          <w:sz w:val="24"/>
+          <w:szCs w:val="24"/>
+        </w:rPr>
+      </w:pPr>
+      <w:r>
+        <w:rPr>
+          <w:rtl w:val="0"/>
+        </w:rPr>
+      </w:r>
+    </w:p>
+    <w:p>
+      <w:pPr>
+        <w:rPr>
+          <w:rFonts w:ascii="Times New Roman" w:cs="Times New Roman" w:eastAsia="Times New Roman" w:hAnsi="Times New Roman"/>
+          <w:sz w:val="24"/>
+          <w:szCs w:val="24"/>
+        </w:rPr>
+      </w:pPr>
+      <w:r>
+        <w:rPr>
+          <w:rFonts w:ascii="Times New Roman" w:cs="Times New Roman" w:eastAsia="Times New Roman" w:hAnsi="Times New Roman"/>
+          <w:sz w:val="24"/>
+          <w:szCs w:val="24"/>
+          <w:rtl w:val="0"/>
+        </w:rPr>
+        <w:t xml:space="preserve">Once the user clicks on one of the book options, the expected information will include: </w:t>
+      </w:r>
+    </w:p>
+    <w:p>
+      <w:pPr>
+        <w:rPr>
+          <w:rFonts w:ascii="Times New Roman" w:cs="Times New Roman" w:eastAsia="Times New Roman" w:hAnsi="Times New Roman"/>
+        </w:rPr>
+      </w:pPr>
+      <w:r>
+        <w:rPr>
+          <w:rtl w:val="0"/>
+        </w:rPr>
+      </w:r>
+    </w:p>
+    <w:p>
+      <w:pPr>
+        <w:numPr>
+          <w:ilvl w:val="0"/>
+          <w:numId w:val="1"/>
+        </w:numPr>
+        <w:ind w:left="720" w:hanging="360"/>
+        <w:rPr>
+          <w:rFonts w:ascii="Times New Roman" w:cs="Times New Roman" w:eastAsia="Times New Roman" w:hAnsi="Times New Roman"/>
+        </w:rPr>
+      </w:pPr>
+      <w:r>
+        <w:rPr>
+          <w:rFonts w:ascii="Times New Roman" w:cs="Times New Roman" w:eastAsia="Times New Roman" w:hAnsi="Times New Roman"/>
+          <w:sz w:val="24"/>
+          <w:szCs w:val="24"/>
+          <w:rtl w:val="0"/>
+        </w:rPr>
+        <w:t xml:space="preserve">Title cover of the book</w:t>
+      </w:r>
+    </w:p>
+    <w:p>
+      <w:pPr>
+        <w:numPr>
+          <w:ilvl w:val="0"/>
+          <w:numId w:val="1"/>
+        </w:numPr>
+        <w:ind w:left="720" w:hanging="360"/>
+        <w:rPr>
+          <w:rFonts w:ascii="Times New Roman" w:cs="Times New Roman" w:eastAsia="Times New Roman" w:hAnsi="Times New Roman"/>
+          <w:sz w:val="24"/>
+          <w:szCs w:val="24"/>
+        </w:rPr>
+      </w:pPr>
+      <w:r>
+        <w:rPr>
+          <w:rFonts w:ascii="Times New Roman" w:cs="Times New Roman" w:eastAsia="Times New Roman" w:hAnsi="Times New Roman"/>
+          <w:sz w:val="24"/>
+          <w:szCs w:val="24"/>
+          <w:rtl w:val="0"/>
+        </w:rPr>
+        <w:t xml:space="preserve">Summary of the book’s contents</w:t>
+      </w:r>
+    </w:p>
+    <w:p>
+      <w:pPr>
+        <w:numPr>
+          <w:ilvl w:val="0"/>
+          <w:numId w:val="1"/>
+        </w:numPr>
+        <w:ind w:left="720" w:hanging="360"/>
+        <w:rPr>
+          <w:rFonts w:ascii="Times New Roman" w:cs="Times New Roman" w:eastAsia="Times New Roman" w:hAnsi="Times New Roman"/>
+          <w:sz w:val="24"/>
+          <w:szCs w:val="24"/>
+        </w:rPr>
+      </w:pPr>
+      <w:r>
+        <w:rPr>
+          <w:rFonts w:ascii="Times New Roman" w:cs="Times New Roman" w:eastAsia="Times New Roman" w:hAnsi="Times New Roman"/>
+          <w:sz w:val="24"/>
+          <w:szCs w:val="24"/>
+          <w:rtl w:val="0"/>
+        </w:rPr>
+        <w:t xml:space="preserve">Author’s name</w:t>
+      </w:r>
+    </w:p>
+    <w:p>
+      <w:pPr>
+        <w:numPr>
+          <w:ilvl w:val="0"/>
+          <w:numId w:val="1"/>
+        </w:numPr>
+        <w:ind w:left="720" w:hanging="360"/>
+        <w:rPr>
+          <w:rFonts w:ascii="Times New Roman" w:cs="Times New Roman" w:eastAsia="Times New Roman" w:hAnsi="Times New Roman"/>
+          <w:sz w:val="24"/>
+          <w:szCs w:val="24"/>
+        </w:rPr>
+      </w:pPr>
+      <w:r>
+        <w:rPr>
+          <w:rFonts w:ascii="Times New Roman" w:cs="Times New Roman" w:eastAsia="Times New Roman" w:hAnsi="Times New Roman"/>
+          <w:sz w:val="24"/>
+          <w:szCs w:val="24"/>
+          <w:rtl w:val="0"/>
+        </w:rPr>
+        <w:t xml:space="preserve">Price </w:t>
+      </w:r>
+    </w:p>
+    <w:p>
+      <w:pPr>
+        <w:numPr>
+          <w:ilvl w:val="0"/>
+          <w:numId w:val="1"/>
+        </w:numPr>
+        <w:ind w:left="720" w:hanging="360"/>
+        <w:rPr>
+          <w:rFonts w:ascii="Times New Roman" w:cs="Times New Roman" w:eastAsia="Times New Roman" w:hAnsi="Times New Roman"/>
+          <w:sz w:val="24"/>
+          <w:szCs w:val="24"/>
+        </w:rPr>
+      </w:pPr>
+      <w:r>
+        <w:rPr>
+          <w:rFonts w:ascii="Times New Roman" w:cs="Times New Roman" w:eastAsia="Times New Roman" w:hAnsi="Times New Roman"/>
+          <w:sz w:val="24"/>
+          <w:szCs w:val="24"/>
+          <w:rtl w:val="0"/>
+        </w:rPr>
+        <w:t xml:space="preserve">Published year </w:t>
+      </w:r>
+    </w:p>
+    <w:p>
+      <w:pPr>
+        <w:numPr>
+          <w:ilvl w:val="0"/>
+          <w:numId w:val="1"/>
+        </w:numPr>
+        <w:ind w:left="720" w:hanging="360"/>
+        <w:rPr>
+          <w:rFonts w:ascii="Times New Roman" w:cs="Times New Roman" w:eastAsia="Times New Roman" w:hAnsi="Times New Roman"/>
+          <w:sz w:val="24"/>
+          <w:szCs w:val="24"/>
+        </w:rPr>
+      </w:pPr>
+      <w:r>
+        <w:rPr>
+          <w:rFonts w:ascii="Times New Roman" w:cs="Times New Roman" w:eastAsia="Times New Roman" w:hAnsi="Times New Roman"/>
+          <w:sz w:val="24"/>
+          <w:szCs w:val="24"/>
+          <w:rtl w:val="0"/>
+        </w:rPr>
+        <w:t xml:space="preserve">Edition number</w:t>
+      </w:r>
+      <w:r>
+        <w:rPr>
+          <w:rFonts w:ascii="Times New Roman" w:cs="Times New Roman" w:eastAsia="Times New Roman" w:hAnsi="Times New Roman"/>
+          <w:sz w:val="24"/>
+          <w:szCs w:val="24"/>
+          <w:rtl w:val="0"/>
+        </w:rPr>
         <w:br w:type="textWrapping"/>
       </w:r>
+      <w:r>
+        <w:rPr>
+          <w:rtl w:val="0"/>
+        </w:rPr>
+      </w:r>
     </w:p>
     <w:p>
       <w:pPr>
@@ -1109,8 +1332,8 @@
           <w:szCs w:val="24"/>
         </w:rPr>
       </w:pPr>
-      <w:bookmarkStart w:colFirst="0" w:colLast="0" w:name="_cl6eln68javj" w:id="3"/>
-      <w:bookmarkEnd w:id="3"/>
+      <w:bookmarkStart w:colFirst="0" w:colLast="0" w:name="_cl6eln68javj" w:id="4"/>
+      <w:bookmarkEnd w:id="4"/>
       <w:r>
         <w:rPr>
           <w:rFonts w:ascii="Times New Roman" w:cs="Times New Roman" w:eastAsia="Times New Roman" w:hAnsi="Times New Roman"/>
@@ -1122,6 +1345,102 @@
           <w:rtl w:val="0"/>
         </w:rPr>
         <w:br w:type="textWrapping"/>
+      </w:r>
+    </w:p>
+    <w:p>
+      <w:pPr>
+        <w:rPr/>
+      </w:pPr>
+      <w:r>
+        <w:rPr>
+          <w:rtl w:val="0"/>
+        </w:rPr>
+      </w:r>
+    </w:p>
+    <w:p>
+      <w:pPr>
+        <w:rPr/>
+      </w:pPr>
+      <w:r>
+        <w:rPr>
+          <w:rtl w:val="0"/>
+        </w:rPr>
+      </w:r>
+    </w:p>
+    <w:p>
+      <w:pPr>
+        <w:rPr/>
+      </w:pPr>
+      <w:r>
+        <w:rPr>
+          <w:rtl w:val="0"/>
+        </w:rPr>
+      </w:r>
+    </w:p>
+    <w:p>
+      <w:pPr>
+        <w:rPr/>
+      </w:pPr>
+      <w:r>
+        <w:rPr>
+          <w:rtl w:val="0"/>
+        </w:rPr>
+      </w:r>
+    </w:p>
+    <w:p>
+      <w:pPr>
+        <w:rPr/>
+      </w:pPr>
+      <w:r>
+        <w:rPr>
+          <w:rtl w:val="0"/>
+        </w:rPr>
+      </w:r>
+    </w:p>
+    <w:p>
+      <w:pPr>
+        <w:pStyle w:val="Heading3"/>
+        <w:rPr>
+          <w:rFonts w:ascii="Times New Roman" w:cs="Times New Roman" w:eastAsia="Times New Roman" w:hAnsi="Times New Roman"/>
+          <w:b w:val="1"/>
+          <w:bCs w:val="1"/>
+          <w:color w:val="000000"/>
+          <w:sz w:val="24"/>
+          <w:szCs w:val="24"/>
+        </w:rPr>
+      </w:pPr>
+      <w:bookmarkStart w:colFirst="0" w:colLast="0" w:name="_3qxhpy14gpox" w:id="5"/>
+      <w:bookmarkEnd w:id="5"/>
+      <w:r>
+        <w:rPr>
+          <w:rtl w:val="0"/>
+        </w:rPr>
+      </w:r>
+    </w:p>
+    <w:p>
+      <w:pPr>
+        <w:pStyle w:val="Heading3"/>
+        <w:rPr>
+          <w:rFonts w:ascii="Times New Roman" w:cs="Times New Roman" w:eastAsia="Times New Roman" w:hAnsi="Times New Roman"/>
+          <w:b w:val="1"/>
+          <w:bCs w:val="1"/>
+          <w:color w:val="000000"/>
+          <w:sz w:val="24"/>
+          <w:szCs w:val="24"/>
+        </w:rPr>
+      </w:pPr>
+      <w:bookmarkStart w:colFirst="0" w:colLast="0" w:name="_8r39e6vhe72s" w:id="6"/>
+      <w:bookmarkEnd w:id="6"/>
+      <w:r>
+        <w:rPr>
+          <w:rFonts w:ascii="Times New Roman" w:cs="Times New Roman" w:eastAsia="Times New Roman" w:hAnsi="Times New Roman"/>
+          <w:b w:val="1"/>
+          <w:bCs w:val="1"/>
+          <w:color w:val="000000"/>
+          <w:sz w:val="24"/>
+          <w:szCs w:val="24"/>
+          <w:rtl w:val="0"/>
+        </w:rPr>
         <w:t xml:space="preserve">Interface Design: </w:t>
       </w:r>
     </w:p>
@@ -1204,14 +1523,14 @@
         </w:rPr>
         <w:drawing>
           <wp:inline distB="114300" distT="114300" distL="114300" distR="114300">
-            <wp:extent cx="4824413" cy="3030721"/>
+            <wp:extent cx="5943600" cy="3924300"/>
             <wp:effectExtent b="0" l="0" r="0" t="0"/>
-            <wp:docPr id="1" name="image2.jpg"/>
+            <wp:docPr id="1" name="image1.jpg"/>
             <a:graphic>
               <a:graphicData uri="http://schemas.openxmlformats.org/drawingml/2006/picture">
                 <pic:pic>
                   <pic:nvPicPr>
-                    <pic:cNvPr id="0" name="image2.jpg"/>
+                    <pic:cNvPr id="0" name="image1.jpg"/>
                     <pic:cNvPicPr preferRelativeResize="0"/>
                   </pic:nvPicPr>
                   <pic:blipFill>
@@ -1224,7 +1543,7 @@
                   <pic:spPr>
                     <a:xfrm>
                       <a:off x="0" y="0"/>
-                      <a:ext cx="4824413" cy="3030721"/>
+                      <a:ext cx="5943600" cy="3924300"/>
                     </a:xfrm>
                     <a:prstGeom prst="rect"/>
                     <a:ln/>
@@ -1279,6 +1598,80 @@
       </w:pPr>
       <w:r>
         <w:rPr>
+          <w:rFonts w:ascii="Times New Roman" w:cs="Times New Roman" w:eastAsia="Times New Roman" w:hAnsi="Times New Roman"/>
+          <w:sz w:val="24"/>
+          <w:szCs w:val="24"/>
+          <w:rtl w:val="0"/>
+        </w:rPr>
+        <w:t xml:space="preserve">This interface has five different options that the user can interact with. There are textboxes designated to the title of the book, author’s name, and general subject. In addition, there are two different types of button added to the interface: a clear (reset) button as well as a show results (submit) button. The clear form is designed to remove any text already written on the interface as well as the results from a previous search (if applicable). The show results button will allow the interface to display books according to the user’s input. </w:t>
+      </w:r>
+    </w:p>
+    <w:p>
+      <w:pPr>
+        <w:rPr>
+          <w:rFonts w:ascii="Times New Roman" w:cs="Times New Roman" w:eastAsia="Times New Roman" w:hAnsi="Times New Roman"/>
+          <w:sz w:val="24"/>
+          <w:szCs w:val="24"/>
+        </w:rPr>
+      </w:pPr>
+      <w:r>
+        <w:rPr>
+          <w:rtl w:val="0"/>
+        </w:rPr>
+      </w:r>
+    </w:p>
+    <w:p>
+      <w:pPr>
+        <w:rPr>
+          <w:rFonts w:ascii="Times New Roman" w:cs="Times New Roman" w:eastAsia="Times New Roman" w:hAnsi="Times New Roman"/>
+          <w:sz w:val="24"/>
+          <w:szCs w:val="24"/>
+        </w:rPr>
+      </w:pPr>
+      <w:r>
+        <w:rPr>
+          <w:rtl w:val="0"/>
+        </w:rPr>
+      </w:r>
+    </w:p>
+    <w:p>
+      <w:pPr>
+        <w:rPr>
+          <w:rFonts w:ascii="Times New Roman" w:cs="Times New Roman" w:eastAsia="Times New Roman" w:hAnsi="Times New Roman"/>
+          <w:sz w:val="24"/>
+          <w:szCs w:val="24"/>
+        </w:rPr>
+      </w:pPr>
+      <w:r>
+        <w:rPr>
+          <w:rtl w:val="0"/>
+        </w:rPr>
+      </w:r>
+    </w:p>
+    <w:p>
+      <w:pPr>
+        <w:rPr>
+          <w:rFonts w:ascii="Times New Roman" w:cs="Times New Roman" w:eastAsia="Times New Roman" w:hAnsi="Times New Roman"/>
+          <w:sz w:val="24"/>
+          <w:szCs w:val="24"/>
+        </w:rPr>
+      </w:pPr>
+      <w:r>
+        <w:rPr>
+          <w:rtl w:val="0"/>
+        </w:rPr>
+      </w:r>
+    </w:p>
+    <w:p>
+      <w:pPr>
+        <w:rPr>
+          <w:rFonts w:ascii="Times New Roman" w:cs="Times New Roman" w:eastAsia="Times New Roman" w:hAnsi="Times New Roman"/>
+          <w:sz w:val="24"/>
+          <w:szCs w:val="24"/>
+        </w:rPr>
+      </w:pPr>
+      <w:r>
+        <w:rPr>
           <w:rtl w:val="0"/>
         </w:rPr>
       </w:r>
@@ -1388,14 +1781,14 @@
         </w:rPr>
         <w:drawing>
           <wp:inline distB="114300" distT="114300" distL="114300" distR="114300">
-            <wp:extent cx="4443413" cy="3332559"/>
+            <wp:extent cx="3676650" cy="5665657"/>
             <wp:effectExtent b="0" l="0" r="0" t="0"/>
-            <wp:docPr id="2" name="image3.jpg"/>
+            <wp:docPr id="3" name="image2.jpg"/>
             <a:graphic>
               <a:graphicData uri="http://schemas.openxmlformats.org/drawingml/2006/picture">
                 <pic:pic>
                   <pic:nvPicPr>
-                    <pic:cNvPr id="0" name="image3.jpg"/>
+                    <pic:cNvPr id="0" name="image2.jpg"/>
                     <pic:cNvPicPr preferRelativeResize="0"/>
                   </pic:nvPicPr>
                   <pic:blipFill>
@@ -1408,7 +1801,7 @@
                   <pic:spPr>
                     <a:xfrm>
                       <a:off x="0" y="0"/>
-                      <a:ext cx="4443413" cy="3332559"/>
+                      <a:ext cx="3676650" cy="5665657"/>
                     </a:xfrm>
                     <a:prstGeom prst="rect"/>
                     <a:ln/>
@@ -1463,190 +1856,12 @@
       </w:pPr>
       <w:r>
         <w:rPr>
-          <w:rtl w:val="0"/>
-        </w:rPr>
-      </w:r>
-    </w:p>
-    <w:p>
-      <w:pPr>
-        <w:rPr>
-          <w:rFonts w:ascii="Times New Roman" w:cs="Times New Roman" w:eastAsia="Times New Roman" w:hAnsi="Times New Roman"/>
-          <w:sz w:val="24"/>
-          <w:szCs w:val="24"/>
-        </w:rPr>
-      </w:pPr>
-      <w:r>
-        <w:rPr>
-          <w:rtl w:val="0"/>
-        </w:rPr>
-      </w:r>
-    </w:p>
-    <w:p>
-      <w:pPr>
-        <w:rPr>
-          <w:rFonts w:ascii="Times New Roman" w:cs="Times New Roman" w:eastAsia="Times New Roman" w:hAnsi="Times New Roman"/>
-          <w:sz w:val="24"/>
-          <w:szCs w:val="24"/>
-        </w:rPr>
-      </w:pPr>
-      <w:r>
-        <w:rPr>
-          <w:rtl w:val="0"/>
-        </w:rPr>
-      </w:r>
-    </w:p>
-    <w:p>
-      <w:pPr>
-        <w:rPr>
-          <w:rFonts w:ascii="Times New Roman" w:cs="Times New Roman" w:eastAsia="Times New Roman" w:hAnsi="Times New Roman"/>
-          <w:sz w:val="24"/>
-          <w:szCs w:val="24"/>
-        </w:rPr>
-      </w:pPr>
-      <w:r>
-        <w:rPr>
-          <w:rtl w:val="0"/>
-        </w:rPr>
-      </w:r>
-    </w:p>
-    <w:p>
-      <w:pPr>
-        <w:rPr>
-          <w:rFonts w:ascii="Times New Roman" w:cs="Times New Roman" w:eastAsia="Times New Roman" w:hAnsi="Times New Roman"/>
-          <w:sz w:val="24"/>
-          <w:szCs w:val="24"/>
-        </w:rPr>
-      </w:pPr>
-      <w:r>
-        <w:rPr>
-          <w:rtl w:val="0"/>
-        </w:rPr>
-      </w:r>
-    </w:p>
-    <w:p>
-      <w:pPr>
-        <w:rPr>
-          <w:rFonts w:ascii="Times New Roman" w:cs="Times New Roman" w:eastAsia="Times New Roman" w:hAnsi="Times New Roman"/>
-          <w:sz w:val="24"/>
-          <w:szCs w:val="24"/>
-        </w:rPr>
-      </w:pPr>
-      <w:r>
-        <w:rPr>
-          <w:rtl w:val="0"/>
-        </w:rPr>
-      </w:r>
-    </w:p>
-    <w:p>
-      <w:pPr>
-        <w:rPr>
-          <w:rFonts w:ascii="Times New Roman" w:cs="Times New Roman" w:eastAsia="Times New Roman" w:hAnsi="Times New Roman"/>
-          <w:sz w:val="24"/>
-          <w:szCs w:val="24"/>
-        </w:rPr>
-      </w:pPr>
-      <w:r>
-        <w:rPr>
-          <w:rtl w:val="0"/>
-        </w:rPr>
-      </w:r>
-    </w:p>
-    <w:p>
-      <w:pPr>
-        <w:rPr>
-          <w:rFonts w:ascii="Times New Roman" w:cs="Times New Roman" w:eastAsia="Times New Roman" w:hAnsi="Times New Roman"/>
-          <w:sz w:val="24"/>
-          <w:szCs w:val="24"/>
-        </w:rPr>
-      </w:pPr>
-      <w:r>
-        <w:rPr>
-          <w:rtl w:val="0"/>
-        </w:rPr>
-      </w:r>
-    </w:p>
-    <w:p>
-      <w:pPr>
-        <w:rPr>
-          <w:rFonts w:ascii="Times New Roman" w:cs="Times New Roman" w:eastAsia="Times New Roman" w:hAnsi="Times New Roman"/>
-          <w:sz w:val="24"/>
-          <w:szCs w:val="24"/>
-        </w:rPr>
-      </w:pPr>
-      <w:r>
-        <w:rPr>
-          <w:rtl w:val="0"/>
-        </w:rPr>
-      </w:r>
-    </w:p>
-    <w:p>
-      <w:pPr>
-        <w:rPr>
-          <w:rFonts w:ascii="Times New Roman" w:cs="Times New Roman" w:eastAsia="Times New Roman" w:hAnsi="Times New Roman"/>
-          <w:sz w:val="24"/>
-          <w:szCs w:val="24"/>
-        </w:rPr>
-      </w:pPr>
-      <w:r>
-        <w:rPr>
-          <w:rtl w:val="0"/>
-        </w:rPr>
-      </w:r>
-    </w:p>
-    <w:p>
-      <w:pPr>
-        <w:rPr>
-          <w:rFonts w:ascii="Times New Roman" w:cs="Times New Roman" w:eastAsia="Times New Roman" w:hAnsi="Times New Roman"/>
-          <w:sz w:val="24"/>
-          <w:szCs w:val="24"/>
-        </w:rPr>
-      </w:pPr>
-      <w:r>
-        <w:rPr>
-          <w:rtl w:val="0"/>
-        </w:rPr>
-      </w:r>
-    </w:p>
-    <w:p>
-      <w:pPr>
-        <w:rPr>
-          <w:rFonts w:ascii="Times New Roman" w:cs="Times New Roman" w:eastAsia="Times New Roman" w:hAnsi="Times New Roman"/>
-          <w:sz w:val="24"/>
-          <w:szCs w:val="24"/>
-        </w:rPr>
-      </w:pPr>
-      <w:r>
-        <w:rPr>
-          <w:rtl w:val="0"/>
-        </w:rPr>
-      </w:r>
-    </w:p>
-    <w:p>
-      <w:pPr>
-        <w:rPr>
-          <w:rFonts w:ascii="Times New Roman" w:cs="Times New Roman" w:eastAsia="Times New Roman" w:hAnsi="Times New Roman"/>
-          <w:sz w:val="24"/>
-          <w:szCs w:val="24"/>
-        </w:rPr>
-      </w:pPr>
-      <w:r>
-        <w:rPr>
-          <w:rtl w:val="0"/>
-        </w:rPr>
-      </w:r>
-    </w:p>
-    <w:p>
-      <w:pPr>
-        <w:rPr>
-          <w:rFonts w:ascii="Times New Roman" w:cs="Times New Roman" w:eastAsia="Times New Roman" w:hAnsi="Times New Roman"/>
-          <w:sz w:val="24"/>
-          <w:szCs w:val="24"/>
-        </w:rPr>
-      </w:pPr>
-      <w:r>
-        <w:rPr>
-          <w:rtl w:val="0"/>
-        </w:rPr>
+          <w:rFonts w:ascii="Times New Roman" w:cs="Times New Roman" w:eastAsia="Times New Roman" w:hAnsi="Times New Roman"/>
+          <w:sz w:val="24"/>
+          <w:szCs w:val="24"/>
+          <w:rtl w:val="0"/>
+        </w:rPr>
+        <w:t xml:space="preserve">Each of the books will have a clickable option to allow the user to seek more information about the book itself. This information will include the author’s name, summary, price, published year, and edition number. </w:t>
       </w:r>
     </w:p>
     <w:p>
@@ -1689,9 +1904,17 @@
           <w:szCs w:val="24"/>
         </w:rPr>
       </w:pPr>
-      <w:bookmarkStart w:colFirst="0" w:colLast="0" w:name="_mmty8ece645o" w:id="4"/>
-      <w:bookmarkEnd w:id="4"/>
-      <w:r>
+      <w:bookmarkStart w:colFirst="0" w:colLast="0" w:name="_hp91kxlytfa8" w:id="7"/>
+      <w:bookmarkEnd w:id="7"/>
+      <w:r>
+        <w:rPr>
+          <w:rtl w:val="0"/>
+        </w:rPr>
+      </w:r>
+    </w:p>
+    <w:p>
+      <w:pPr>
+        <w:pStyle w:val="Heading3"/>
         <w:rPr>
           <w:rFonts w:ascii="Times New Roman" w:cs="Times New Roman" w:eastAsia="Times New Roman" w:hAnsi="Times New Roman"/>
           <w:b w:val="1"/>
@@ -1699,6 +1922,18 @@
           <w:color w:val="000000"/>
           <w:sz w:val="24"/>
           <w:szCs w:val="24"/>
+        </w:rPr>
+      </w:pPr>
+      <w:bookmarkStart w:colFirst="0" w:colLast="0" w:name="_mmty8ece645o" w:id="8"/>
+      <w:bookmarkEnd w:id="8"/>
+      <w:r>
+        <w:rPr>
+          <w:rFonts w:ascii="Times New Roman" w:cs="Times New Roman" w:eastAsia="Times New Roman" w:hAnsi="Times New Roman"/>
+          <w:b w:val="1"/>
+          <w:bCs w:val="1"/>
+          <w:color w:val="000000"/>
+          <w:sz w:val="24"/>
+          <w:szCs w:val="24"/>
           <w:rtl w:val="0"/>
         </w:rPr>
         <w:t xml:space="preserve">Entity- Relationship (ER) Model:</w:t>
@@ -1750,20 +1985,6 @@
           <w:rtl w:val="0"/>
         </w:rPr>
         <w:t xml:space="preserve">An entity-relationship model is constructed to showcase how each data from the interface correlates to one another. </w:t>
-      </w:r>
-    </w:p>
-    <w:p>
-      <w:pPr>
-        <w:rPr>
-          <w:rFonts w:ascii="Times New Roman" w:cs="Times New Roman" w:eastAsia="Times New Roman" w:hAnsi="Times New Roman"/>
-          <w:sz w:val="24"/>
-          <w:szCs w:val="24"/>
-        </w:rPr>
-      </w:pPr>
-      <w:r>
-        <w:rPr>
-          <w:rtl w:val="0"/>
-        </w:rPr>
       </w:r>
     </w:p>
     <w:p>
@@ -1813,12 +2034,12 @@
           <wp:inline distB="114300" distT="114300" distL="114300" distR="114300">
             <wp:extent cx="4181475" cy="5575300"/>
             <wp:effectExtent b="0" l="0" r="0" t="0"/>
-            <wp:docPr id="3" name="image1.jpg"/>
+            <wp:docPr id="2" name="image3.jpg"/>
             <a:graphic>
               <a:graphicData uri="http://schemas.openxmlformats.org/drawingml/2006/picture">
                 <pic:pic>
                   <pic:nvPicPr>
-                    <pic:cNvPr id="0" name="image1.jpg"/>
+                    <pic:cNvPr id="0" name="image3.jpg"/>
                     <pic:cNvPicPr preferRelativeResize="0"/>
                   </pic:nvPicPr>
                   <pic:blipFill>
@@ -1858,7 +2079,121 @@
 </file>
 
 <file path=word/numbering.xml><?xml version="1.0" encoding="utf-8"?>
-<w:numbering xmlns:mc="http://schemas.openxmlformats.org/markup-compatibility/2006" xmlns:o="urn:schemas-microsoft-com:office:office" xmlns:r="http://schemas.openxmlformats.org/officeDocument/2006/relationships" xmlns:m="http://schemas.openxmlformats.org/officeDocument/2006/math" xmlns:v="urn:schemas-microsoft-com:vml" xmlns:wp="http://schemas.openxmlformats.org/drawingml/2006/wordprocessingDrawing" xmlns:w10="urn:schemas-microsoft-com:office:word" xmlns:w="http://schemas.openxmlformats.org/wordprocessingml/2006/main" xmlns:wne="http://schemas.microsoft.com/office/word/2006/wordml" xmlns:sl="http://schemas.openxmlformats.org/schemaLibrary/2006/main" xmlns:a="http://schemas.openxmlformats.org/drawingml/2006/main" xmlns:pic="http://schemas.openxmlformats.org/drawingml/2006/picture" xmlns:c="http://schemas.openxmlformats.org/drawingml/2006/chart" xmlns:lc="http://schemas.openxmlformats.org/drawingml/2006/lockedCanvas" xmlns:dgm="http://schemas.openxmlformats.org/drawingml/2006/diagram" xmlns:wps="http://schemas.microsoft.com/office/word/2010/wordprocessingShape" xmlns:wpg="http://schemas.microsoft.com/office/word/2010/wordprocessingGroup" xmlns:w14="http://schemas.microsoft.com/office/word/2010/wordml" xmlns:w15="http://schemas.microsoft.com/office/word/2012/wordml" xmlns:w16="http://schemas.microsoft.com/office/word/2018/wordml" xmlns:w16cex="http://schemas.microsoft.com/office/word/2018/wordml/cex" xmlns:w16cid="http://schemas.microsoft.com/office/word/2016/wordml/cid" xmlns="http://schemas.microsoft.com/office/tasks/2019/documenttasks" xmlns:cr="http://schemas.microsoft.com/office/comments/2020/reactions"/>
+<w:numbering xmlns:mc="http://schemas.openxmlformats.org/markup-compatibility/2006" xmlns:o="urn:schemas-microsoft-com:office:office" xmlns:r="http://schemas.openxmlformats.org/officeDocument/2006/relationships" xmlns:m="http://schemas.openxmlformats.org/officeDocument/2006/math" xmlns:v="urn:schemas-microsoft-com:vml" xmlns:wp="http://schemas.openxmlformats.org/drawingml/2006/wordprocessingDrawing" xmlns:w10="urn:schemas-microsoft-com:office:word" xmlns:w="http://schemas.openxmlformats.org/wordprocessingml/2006/main" xmlns:wne="http://schemas.microsoft.com/office/word/2006/wordml" xmlns:sl="http://schemas.openxmlformats.org/schemaLibrary/2006/main" xmlns:a="http://schemas.openxmlformats.org/drawingml/2006/main" xmlns:pic="http://schemas.openxmlformats.org/drawingml/2006/picture" xmlns:c="http://schemas.openxmlformats.org/drawingml/2006/chart" xmlns:lc="http://schemas.openxmlformats.org/drawingml/2006/lockedCanvas" xmlns:dgm="http://schemas.openxmlformats.org/drawingml/2006/diagram" xmlns:wps="http://schemas.microsoft.com/office/word/2010/wordprocessingShape" xmlns:wpg="http://schemas.microsoft.com/office/word/2010/wordprocessingGroup" xmlns:w14="http://schemas.microsoft.com/office/word/2010/wordml" xmlns:w15="http://schemas.microsoft.com/office/word/2012/wordml" xmlns:w16="http://schemas.microsoft.com/office/word/2018/wordml" xmlns:w16cex="http://schemas.microsoft.com/office/word/2018/wordml/cex" xmlns:w16cid="http://schemas.microsoft.com/office/word/2016/wordml/cid" xmlns="http://schemas.microsoft.com/office/tasks/2019/documenttasks" xmlns:cr="http://schemas.microsoft.com/office/comments/2020/reactions">
+  <w:abstractNum w:abstractNumId="1">
+    <w:lvl w:ilvl="0">
+      <w:start w:val="1"/>
+      <w:numFmt w:val="bullet"/>
+      <w:lvlText w:val="-"/>
+      <w:lvlJc w:val="left"/>
+      <w:pPr>
+        <w:ind w:left="720" w:hanging="360"/>
+      </w:pPr>
+      <w:rPr>
+        <w:u w:val="none"/>
+      </w:rPr>
+    </w:lvl>
+    <w:lvl w:ilvl="1">
+      <w:start w:val="1"/>
+      <w:numFmt w:val="bullet"/>
+      <w:lvlText w:val="-"/>
+      <w:lvlJc w:val="left"/>
+      <w:pPr>
+        <w:ind w:left="1440" w:hanging="360"/>
+      </w:pPr>
+      <w:rPr>
+        <w:u w:val="none"/>
+      </w:rPr>
+    </w:lvl>
+    <w:lvl w:ilvl="2">
+      <w:start w:val="1"/>
+      <w:numFmt w:val="bullet"/>
+      <w:lvlText w:val="-"/>
+      <w:lvlJc w:val="left"/>
+      <w:pPr>
+        <w:ind w:left="2160" w:hanging="360"/>
+      </w:pPr>
+      <w:rPr>
+        <w:u w:val="none"/>
+      </w:rPr>
+    </w:lvl>
+    <w:lvl w:ilvl="3">
+      <w:start w:val="1"/>
+      <w:numFmt w:val="bullet"/>
+      <w:lvlText w:val="-"/>
+      <w:lvlJc w:val="left"/>
+      <w:pPr>
+        <w:ind w:left="2880" w:hanging="360"/>
+      </w:pPr>
+      <w:rPr>
+        <w:u w:val="none"/>
+      </w:rPr>
+    </w:lvl>
+    <w:lvl w:ilvl="4">
+      <w:start w:val="1"/>
+      <w:numFmt w:val="bullet"/>
+      <w:lvlText w:val="-"/>
+      <w:lvlJc w:val="left"/>
+      <w:pPr>
+        <w:ind w:left="3600" w:hanging="360"/>
+      </w:pPr>
+      <w:rPr>
+        <w:u w:val="none"/>
+      </w:rPr>
+    </w:lvl>
+    <w:lvl w:ilvl="5">
+      <w:start w:val="1"/>
+      <w:numFmt w:val="bullet"/>
+      <w:lvlText w:val="-"/>
+      <w:lvlJc w:val="left"/>
+      <w:pPr>
+        <w:ind w:left="4320" w:hanging="360"/>
+      </w:pPr>
+      <w:rPr>
+        <w:u w:val="none"/>
+      </w:rPr>
+    </w:lvl>
+    <w:lvl w:ilvl="6">
+      <w:start w:val="1"/>
+      <w:numFmt w:val="bullet"/>
+      <w:lvlText w:val="-"/>
+      <w:lvlJc w:val="left"/>
+      <w:pPr>
+        <w:ind w:left="5040" w:hanging="360"/>
+      </w:pPr>
+      <w:rPr>
+        <w:u w:val="none"/>
+      </w:rPr>
+    </w:lvl>
+    <w:lvl w:ilvl="7">
+      <w:start w:val="1"/>
+      <w:numFmt w:val="bullet"/>
+      <w:lvlText w:val="-"/>
+      <w:lvlJc w:val="left"/>
+      <w:pPr>
+        <w:ind w:left="5760" w:hanging="360"/>
+      </w:pPr>
+      <w:rPr>
+        <w:u w:val="none"/>
+      </w:rPr>
+    </w:lvl>
+    <w:lvl w:ilvl="8">
+      <w:start w:val="1"/>
+      <w:numFmt w:val="bullet"/>
+      <w:lvlText w:val="-"/>
+      <w:lvlJc w:val="left"/>
+      <w:pPr>
+        <w:ind w:left="6480" w:hanging="360"/>
+      </w:pPr>
+      <w:rPr>
+        <w:u w:val="none"/>
+      </w:rPr>
+    </w:lvl>
+  </w:abstractNum>
+  <w:num w:numId="1">
+    <w:abstractNumId w:val="1"/>
+  </w:num>
+</w:numbering>
 </file>
 
 <file path=word/styles.xml><?xml version="1.0" encoding="utf-8"?>

</xml_diff>

<commit_message>
Updated link on skills section
</commit_message>
<xml_diff>
--- a/Portfolio-Items/assets/projects/Book Interface Project Analysis_ Design.docx
+++ b/Portfolio-Items/assets/projects/Book Interface Project Analysis_ Design.docx
@@ -1525,12 +1525,12 @@
           <wp:inline distB="114300" distT="114300" distL="114300" distR="114300">
             <wp:extent cx="5943600" cy="3924300"/>
             <wp:effectExtent b="0" l="0" r="0" t="0"/>
-            <wp:docPr id="1" name="image1.jpg"/>
+            <wp:docPr id="1" name="image3.jpg"/>
             <a:graphic>
               <a:graphicData uri="http://schemas.openxmlformats.org/drawingml/2006/picture">
                 <pic:pic>
                   <pic:nvPicPr>
-                    <pic:cNvPr id="0" name="image1.jpg"/>
+                    <pic:cNvPr id="0" name="image3.jpg"/>
                     <pic:cNvPicPr preferRelativeResize="0"/>
                   </pic:nvPicPr>
                   <pic:blipFill>
@@ -1603,7 +1603,7 @@
           <w:szCs w:val="24"/>
           <w:rtl w:val="0"/>
         </w:rPr>
-        <w:t xml:space="preserve">This interface has five different options that the user can interact with. There are textboxes designated to the title of the book, author’s name, and general subject. In addition, there are two different types of button added to the interface: a clear (reset) button as well as a show results (submit) button. The clear form is designed to remove any text already written on the interface as well as the results from a previous search (if applicable). The show results button will allow the interface to display books according to the user’s input. </w:t>
+        <w:t xml:space="preserve">This interface has five different options that the user can interact with. There are textboxes designated to the title of the book, author’s name, and general subject. In addition, there are two different types of button added to the interface: a clear (reset) button as well as a show results (submit) button. The clear button is designed to remove any text already written on the interface as well as the results from a previous search (if applicable). The show results button will allow the interface to display books according to the user’s input. </w:t>
       </w:r>
     </w:p>
     <w:p>
@@ -2034,12 +2034,12 @@
           <wp:inline distB="114300" distT="114300" distL="114300" distR="114300">
             <wp:extent cx="4181475" cy="5575300"/>
             <wp:effectExtent b="0" l="0" r="0" t="0"/>
-            <wp:docPr id="2" name="image3.jpg"/>
+            <wp:docPr id="2" name="image1.jpg"/>
             <a:graphic>
               <a:graphicData uri="http://schemas.openxmlformats.org/drawingml/2006/picture">
                 <pic:pic>
                   <pic:nvPicPr>
-                    <pic:cNvPr id="0" name="image3.jpg"/>
+                    <pic:cNvPr id="0" name="image1.jpg"/>
                     <pic:cNvPicPr preferRelativeResize="0"/>
                   </pic:nvPicPr>
                   <pic:blipFill>

</xml_diff>